<commit_message>
Draft docx: give each table image a unique drawing ID so it imports into Google Docs
Co-Authored-By: Claude Opus 5.5 <noreply@anthropic.com>
Claude-Session: https://claude.ai/code/session_014jcztH5ED9azi7rTfVfcYN
</commit_message>
<xml_diff>
--- a/drafts/Technology_Reporting_Crimes_Against_Women_India_draft.docx
+++ b/drafts/Technology_Reporting_Crimes_Against_Women_India_draft.docx
@@ -2853,13 +2853,13 @@
               <a:graphicData uri="http://schemas.openxmlformats.org/drawingml/2006/picture">
                 <pic:pic xmlns:pic="http://schemas.openxmlformats.org/drawingml/2006/picture">
                   <pic:nvPicPr>
-                    <pic:cNvPr id="0" name="" descr=""/>
+                    <pic:cNvPr id="1" name="Picture 1" descr=""/>
                     <pic:cNvPicPr>
                       <a:picLocks noChangeAspect="1" noChangeArrowheads="1"/>
                     </pic:cNvPicPr>
                   </pic:nvPicPr>
                   <pic:blipFill>
-                    <a:blip r:embed="rId9" cstate="none"/>
+                    <a:blip r:embed="rId9"/>
                     <a:srcRect/>
                     <a:stretch>
                       <a:fillRect/>
@@ -2955,7 +2955,7 @@
           <wp:inline distT="0" distB="0" distL="0" distR="0">
             <wp:extent cx="4600575" cy="3067050"/>
             <wp:effectExtent t="0" r="0" b="0" l="0"/>
-            <wp:docPr id="1" name="table_1.2" descr="Table 1.2  Step 1: same models. Outcome: offline crimes against women" title="Table 1.2  Step 1: same models. Outcome: offline crimes against women"/>
+            <wp:docPr id="2" name="table_1.2" descr="Table 1.2  Step 1: same models. Outcome: offline crimes against women" title="Table 1.2  Step 1: same models. Outcome: offline crimes against women"/>
             <wp:cNvGraphicFramePr>
               <a:graphicFrameLocks xmlns:a="http://schemas.openxmlformats.org/drawingml/2006/main" noChangeAspect="1"/>
             </wp:cNvGraphicFramePr>
@@ -2963,13 +2963,13 @@
               <a:graphicData uri="http://schemas.openxmlformats.org/drawingml/2006/picture">
                 <pic:pic xmlns:pic="http://schemas.openxmlformats.org/drawingml/2006/picture">
                   <pic:nvPicPr>
-                    <pic:cNvPr id="0" name="" descr=""/>
+                    <pic:cNvPr id="2" name="Picture 2" descr=""/>
                     <pic:cNvPicPr>
                       <a:picLocks noChangeAspect="1" noChangeArrowheads="1"/>
                     </pic:cNvPicPr>
                   </pic:nvPicPr>
                   <pic:blipFill>
-                    <a:blip r:embed="rId10" cstate="none"/>
+                    <a:blip r:embed="rId10"/>
                     <a:srcRect/>
                     <a:stretch>
                       <a:fillRect/>
@@ -3065,7 +3065,7 @@
           <wp:inline distT="0" distB="0" distL="0" distR="0">
             <wp:extent cx="5734050" cy="1333500"/>
             <wp:effectExtent t="0" r="0" b="0" l="0"/>
-            <wp:docPr id="1" name="table_1.3" descr="Table 1.3  Step 2: Model 1, extra yearly growth per SD of access, 2017–2024" title="Table 1.3  Step 2: Model 1, extra yearly growth per SD of access, 2017–2024"/>
+            <wp:docPr id="3" name="table_1.3" descr="Table 1.3  Step 2: Model 1, extra yearly growth per SD of access, 2017–2024" title="Table 1.3  Step 2: Model 1, extra yearly growth per SD of access, 2017–2024"/>
             <wp:cNvGraphicFramePr>
               <a:graphicFrameLocks xmlns:a="http://schemas.openxmlformats.org/drawingml/2006/main" noChangeAspect="1"/>
             </wp:cNvGraphicFramePr>
@@ -3073,13 +3073,13 @@
               <a:graphicData uri="http://schemas.openxmlformats.org/drawingml/2006/picture">
                 <pic:pic xmlns:pic="http://schemas.openxmlformats.org/drawingml/2006/picture">
                   <pic:nvPicPr>
-                    <pic:cNvPr id="0" name="" descr=""/>
+                    <pic:cNvPr id="3" name="Picture 3" descr=""/>
                     <pic:cNvPicPr>
                       <a:picLocks noChangeAspect="1" noChangeArrowheads="1"/>
                     </pic:cNvPicPr>
                   </pic:nvPicPr>
                   <pic:blipFill>
-                    <a:blip r:embed="rId11" cstate="none"/>
+                    <a:blip r:embed="rId11"/>
                     <a:srcRect/>
                     <a:stretch>
                       <a:fillRect/>
@@ -3175,7 +3175,7 @@
           <wp:inline distT="0" distB="0" distL="0" distR="0">
             <wp:extent cx="5734050" cy="1866900"/>
             <wp:effectExtent t="0" r="0" b="0" l="0"/>
-            <wp:docPr id="1" name="table_1.4" descr="Table 1.4  Step 3: TRAI connections, per 10 more connections per 100 people, 2022–2024" title="Table 1.4  Step 3: TRAI connections, per 10 more connections per 100 people, 2022–2024"/>
+            <wp:docPr id="4" name="table_1.4" descr="Table 1.4  Step 3: TRAI connections, per 10 more connections per 100 people, 2022–2024" title="Table 1.4  Step 3: TRAI connections, per 10 more connections per 100 people, 2022–2024"/>
             <wp:cNvGraphicFramePr>
               <a:graphicFrameLocks xmlns:a="http://schemas.openxmlformats.org/drawingml/2006/main" noChangeAspect="1"/>
             </wp:cNvGraphicFramePr>
@@ -3183,13 +3183,13 @@
               <a:graphicData uri="http://schemas.openxmlformats.org/drawingml/2006/picture">
                 <pic:pic xmlns:pic="http://schemas.openxmlformats.org/drawingml/2006/picture">
                   <pic:nvPicPr>
-                    <pic:cNvPr id="0" name="" descr=""/>
+                    <pic:cNvPr id="4" name="Picture 4" descr=""/>
                     <pic:cNvPicPr>
                       <a:picLocks noChangeAspect="1" noChangeArrowheads="1"/>
                     </pic:cNvPicPr>
                   </pic:nvPicPr>
                   <pic:blipFill>
-                    <a:blip r:embed="rId12" cstate="none"/>
+                    <a:blip r:embed="rId12"/>
                     <a:srcRect/>
                     <a:stretch>
                       <a:fillRect/>
@@ -3268,7 +3268,7 @@
           <wp:inline distT="0" distB="0" distL="0" distR="0">
             <wp:extent cx="2428875" cy="2200275"/>
             <wp:effectExtent t="0" r="0" b="0" l="0"/>
-            <wp:docPr id="1" name="table_1.5" descr="Table 1.5  India by year, 2017–2024" title="Table 1.5  India by year, 2017–2024"/>
+            <wp:docPr id="5" name="table_1.5" descr="Table 1.5  India by year, 2017–2024" title="Table 1.5  India by year, 2017–2024"/>
             <wp:cNvGraphicFramePr>
               <a:graphicFrameLocks xmlns:a="http://schemas.openxmlformats.org/drawingml/2006/main" noChangeAspect="1"/>
             </wp:cNvGraphicFramePr>
@@ -3276,13 +3276,13 @@
               <a:graphicData uri="http://schemas.openxmlformats.org/drawingml/2006/picture">
                 <pic:pic xmlns:pic="http://schemas.openxmlformats.org/drawingml/2006/picture">
                   <pic:nvPicPr>
-                    <pic:cNvPr id="0" name="" descr=""/>
+                    <pic:cNvPr id="5" name="Picture 5" descr=""/>
                     <pic:cNvPicPr>
                       <a:picLocks noChangeAspect="1" noChangeArrowheads="1"/>
                     </pic:cNvPicPr>
                   </pic:nvPicPr>
                   <pic:blipFill>
-                    <a:blip r:embed="rId13" cstate="none"/>
+                    <a:blip r:embed="rId13"/>
                     <a:srcRect/>
                     <a:stretch>
                       <a:fillRect/>
@@ -3442,7 +3442,7 @@
           <wp:inline distT="0" distB="0" distL="0" distR="0">
             <wp:extent cx="5476875" cy="2076450"/>
             <wp:effectExtent t="0" r="0" b="0" l="0"/>
-            <wp:docPr id="1" name="table_2.1" descr="Table 2.1  Cyber crime and the &quot;other&quot; category, India" title="Table 2.1  Cyber crime and the &quot;other&quot; category, India"/>
+            <wp:docPr id="6" name="table_2.1" descr="Table 2.1  Cyber crime and the &quot;other&quot; category, India" title="Table 2.1  Cyber crime and the &quot;other&quot; category, India"/>
             <wp:cNvGraphicFramePr>
               <a:graphicFrameLocks xmlns:a="http://schemas.openxmlformats.org/drawingml/2006/main" noChangeAspect="1"/>
             </wp:cNvGraphicFramePr>
@@ -3450,13 +3450,13 @@
               <a:graphicData uri="http://schemas.openxmlformats.org/drawingml/2006/picture">
                 <pic:pic xmlns:pic="http://schemas.openxmlformats.org/drawingml/2006/picture">
                   <pic:nvPicPr>
-                    <pic:cNvPr id="0" name="" descr=""/>
+                    <pic:cNvPr id="6" name="Picture 6" descr=""/>
                     <pic:cNvPicPr>
                       <a:picLocks noChangeAspect="1" noChangeArrowheads="1"/>
                     </pic:cNvPicPr>
                   </pic:nvPicPr>
                   <pic:blipFill>
-                    <a:blip r:embed="rId14" cstate="none"/>
+                    <a:blip r:embed="rId14"/>
                     <a:srcRect/>
                     <a:stretch>
                       <a:fillRect/>
@@ -3552,7 +3552,7 @@
           <wp:inline distT="0" distB="0" distL="0" distR="0">
             <wp:extent cx="5734050" cy="1562100"/>
             <wp:effectExtent t="0" r="0" b="0" l="0"/>
-            <wp:docPr id="1" name="table_2.2" descr="Table 2.2  Model 2: change after 2022 per SD of exposure" title="Table 2.2  Model 2: change after 2022 per SD of exposure"/>
+            <wp:docPr id="7" name="table_2.2" descr="Table 2.2  Model 2: change after 2022 per SD of exposure" title="Table 2.2  Model 2: change after 2022 per SD of exposure"/>
             <wp:cNvGraphicFramePr>
               <a:graphicFrameLocks xmlns:a="http://schemas.openxmlformats.org/drawingml/2006/main" noChangeAspect="1"/>
             </wp:cNvGraphicFramePr>
@@ -3560,13 +3560,13 @@
               <a:graphicData uri="http://schemas.openxmlformats.org/drawingml/2006/picture">
                 <pic:pic xmlns:pic="http://schemas.openxmlformats.org/drawingml/2006/picture">
                   <pic:nvPicPr>
-                    <pic:cNvPr id="0" name="" descr=""/>
+                    <pic:cNvPr id="7" name="Picture 7" descr=""/>
                     <pic:cNvPicPr>
                       <a:picLocks noChangeAspect="1" noChangeArrowheads="1"/>
                     </pic:cNvPicPr>
                   </pic:nvPicPr>
                   <pic:blipFill>
-                    <a:blip r:embed="rId15" cstate="none"/>
+                    <a:blip r:embed="rId15"/>
                     <a:srcRect/>
                     <a:stretch>
                       <a:fillRect/>
@@ -3645,7 +3645,7 @@
           <wp:inline distT="0" distB="0" distL="0" distR="0">
             <wp:extent cx="5734050" cy="876300"/>
             <wp:effectExtent t="0" r="0" b="0" l="0"/>
-            <wp:docPr id="1" name="table_2.3" descr="Table 2.3  Event study, base year 2022, NFHS-5 exposure" title="Table 2.3  Event study, base year 2022, NFHS-5 exposure"/>
+            <wp:docPr id="8" name="table_2.3" descr="Table 2.3  Event study, base year 2022, NFHS-5 exposure" title="Table 2.3  Event study, base year 2022, NFHS-5 exposure"/>
             <wp:cNvGraphicFramePr>
               <a:graphicFrameLocks xmlns:a="http://schemas.openxmlformats.org/drawingml/2006/main" noChangeAspect="1"/>
             </wp:cNvGraphicFramePr>
@@ -3653,13 +3653,13 @@
               <a:graphicData uri="http://schemas.openxmlformats.org/drawingml/2006/picture">
                 <pic:pic xmlns:pic="http://schemas.openxmlformats.org/drawingml/2006/picture">
                   <pic:nvPicPr>
-                    <pic:cNvPr id="0" name="" descr=""/>
+                    <pic:cNvPr id="8" name="Picture 8" descr=""/>
                     <pic:cNvPicPr>
                       <a:picLocks noChangeAspect="1" noChangeArrowheads="1"/>
                     </pic:cNvPicPr>
                   </pic:nvPicPr>
                   <pic:blipFill>
-                    <a:blip r:embed="rId16" cstate="none"/>
+                    <a:blip r:embed="rId16"/>
                     <a:srcRect/>
                     <a:stretch>
                       <a:fillRect/>
@@ -3755,7 +3755,7 @@
           <wp:inline distT="0" distB="0" distL="0" distR="0">
             <wp:extent cx="5543550" cy="1695450"/>
             <wp:effectExtent t="0" r="0" b="0" l="0"/>
-            <wp:docPr id="1" name="table_2.4" descr="Table 2.4  Validity checks, NFHS-5 exposure" title="Table 2.4  Validity checks, NFHS-5 exposure"/>
+            <wp:docPr id="9" name="table_2.4" descr="Table 2.4  Validity checks, NFHS-5 exposure" title="Table 2.4  Validity checks, NFHS-5 exposure"/>
             <wp:cNvGraphicFramePr>
               <a:graphicFrameLocks xmlns:a="http://schemas.openxmlformats.org/drawingml/2006/main" noChangeAspect="1"/>
             </wp:cNvGraphicFramePr>
@@ -3763,13 +3763,13 @@
               <a:graphicData uri="http://schemas.openxmlformats.org/drawingml/2006/picture">
                 <pic:pic xmlns:pic="http://schemas.openxmlformats.org/drawingml/2006/picture">
                   <pic:nvPicPr>
-                    <pic:cNvPr id="0" name="" descr=""/>
+                    <pic:cNvPr id="9" name="Picture 9" descr=""/>
                     <pic:cNvPicPr>
                       <a:picLocks noChangeAspect="1" noChangeArrowheads="1"/>
                     </pic:cNvPicPr>
                   </pic:nvPicPr>
                   <pic:blipFill>
-                    <a:blip r:embed="rId17" cstate="none"/>
+                    <a:blip r:embed="rId17"/>
                     <a:srcRect/>
                     <a:stretch>
                       <a:fillRect/>
@@ -3865,7 +3865,7 @@
           <wp:inline distT="0" distB="0" distL="0" distR="0">
             <wp:extent cx="5734050" cy="3257550"/>
             <wp:effectExtent t="0" r="0" b="0" l="0"/>
-            <wp:docPr id="1" name="table_2.5a" descr="Table 2.5a  Labelling controls (NFHS-5 exposure unless named)" title="Table 2.5a  Labelling controls (NFHS-5 exposure unless named)"/>
+            <wp:docPr id="10" name="table_2.5a" descr="Table 2.5a  Labelling controls (NFHS-5 exposure unless named)" title="Table 2.5a  Labelling controls (NFHS-5 exposure unless named)"/>
             <wp:cNvGraphicFramePr>
               <a:graphicFrameLocks xmlns:a="http://schemas.openxmlformats.org/drawingml/2006/main" noChangeAspect="1"/>
             </wp:cNvGraphicFramePr>
@@ -3873,13 +3873,13 @@
               <a:graphicData uri="http://schemas.openxmlformats.org/drawingml/2006/picture">
                 <pic:pic xmlns:pic="http://schemas.openxmlformats.org/drawingml/2006/picture">
                   <pic:nvPicPr>
-                    <pic:cNvPr id="0" name="" descr=""/>
+                    <pic:cNvPr id="10" name="Picture 10" descr=""/>
                     <pic:cNvPicPr>
                       <a:picLocks noChangeAspect="1" noChangeArrowheads="1"/>
                     </pic:cNvPicPr>
                   </pic:nvPicPr>
                   <pic:blipFill>
-                    <a:blip r:embed="rId18" cstate="none"/>
+                    <a:blip r:embed="rId18"/>
                     <a:srcRect/>
                     <a:stretch>
                       <a:fillRect/>
@@ -3975,7 +3975,7 @@
           <wp:inline distT="0" distB="0" distL="0" distR="0">
             <wp:extent cx="3371850" cy="3190875"/>
             <wp:effectExtent t="0" r="0" b="0" l="0"/>
-            <wp:docPr id="1" name="table_2.5b" descr="Table 2.5b  Capacity controls, 33 States" title="Table 2.5b  Capacity controls, 33 States"/>
+            <wp:docPr id="11" name="table_2.5b" descr="Table 2.5b  Capacity controls, 33 States" title="Table 2.5b  Capacity controls, 33 States"/>
             <wp:cNvGraphicFramePr>
               <a:graphicFrameLocks xmlns:a="http://schemas.openxmlformats.org/drawingml/2006/main" noChangeAspect="1"/>
             </wp:cNvGraphicFramePr>
@@ -3983,13 +3983,13 @@
               <a:graphicData uri="http://schemas.openxmlformats.org/drawingml/2006/picture">
                 <pic:pic xmlns:pic="http://schemas.openxmlformats.org/drawingml/2006/picture">
                   <pic:nvPicPr>
-                    <pic:cNvPr id="0" name="" descr=""/>
+                    <pic:cNvPr id="11" name="Picture 11" descr=""/>
                     <pic:cNvPicPr>
                       <a:picLocks noChangeAspect="1" noChangeArrowheads="1"/>
                     </pic:cNvPicPr>
                   </pic:nvPicPr>
                   <pic:blipFill>
-                    <a:blip r:embed="rId19" cstate="none"/>
+                    <a:blip r:embed="rId19"/>
                     <a:srcRect/>
                     <a:stretch>
                       <a:fillRect/>
@@ -4085,7 +4085,7 @@
           <wp:inline distT="0" distB="0" distL="0" distR="0">
             <wp:extent cx="4543425" cy="1828800"/>
             <wp:effectExtent t="0" r="0" b="0" l="0"/>
-            <wp:docPr id="1" name="table_2.6" descr="Table 2.6  Expanding cyber policing within States, 2020–2024" title="Table 2.6  Expanding cyber policing within States, 2020–2024"/>
+            <wp:docPr id="12" name="table_2.6" descr="Table 2.6  Expanding cyber policing within States, 2020–2024" title="Table 2.6  Expanding cyber policing within States, 2020–2024"/>
             <wp:cNvGraphicFramePr>
               <a:graphicFrameLocks xmlns:a="http://schemas.openxmlformats.org/drawingml/2006/main" noChangeAspect="1"/>
             </wp:cNvGraphicFramePr>
@@ -4093,13 +4093,13 @@
               <a:graphicData uri="http://schemas.openxmlformats.org/drawingml/2006/picture">
                 <pic:pic xmlns:pic="http://schemas.openxmlformats.org/drawingml/2006/picture">
                   <pic:nvPicPr>
-                    <pic:cNvPr id="0" name="" descr=""/>
+                    <pic:cNvPr id="12" name="Picture 12" descr=""/>
                     <pic:cNvPicPr>
                       <a:picLocks noChangeAspect="1" noChangeArrowheads="1"/>
                     </pic:cNvPicPr>
                   </pic:nvPicPr>
                   <pic:blipFill>
-                    <a:blip r:embed="rId20" cstate="none"/>
+                    <a:blip r:embed="rId20"/>
                     <a:srcRect/>
                     <a:stretch>
                       <a:fillRect/>
@@ -4259,7 +4259,7 @@
           <wp:inline distT="0" distB="0" distL="0" distR="0">
             <wp:extent cx="4714875" cy="1952625"/>
             <wp:effectExtent t="0" r="0" b="0" l="0"/>
-            <wp:docPr id="1" name="table_3.1" descr="Table 3.1  Police records and platform complaints by year, India" title="Table 3.1  Police records and platform complaints by year, India"/>
+            <wp:docPr id="13" name="table_3.1" descr="Table 3.1  Police records and platform complaints by year, India" title="Table 3.1  Police records and platform complaints by year, India"/>
             <wp:cNvGraphicFramePr>
               <a:graphicFrameLocks xmlns:a="http://schemas.openxmlformats.org/drawingml/2006/main" noChangeAspect="1"/>
             </wp:cNvGraphicFramePr>
@@ -4267,13 +4267,13 @@
               <a:graphicData uri="http://schemas.openxmlformats.org/drawingml/2006/picture">
                 <pic:pic xmlns:pic="http://schemas.openxmlformats.org/drawingml/2006/picture">
                   <pic:nvPicPr>
-                    <pic:cNvPr id="0" name="" descr=""/>
+                    <pic:cNvPr id="13" name="Picture 13" descr=""/>
                     <pic:cNvPicPr>
                       <a:picLocks noChangeAspect="1" noChangeArrowheads="1"/>
                     </pic:cNvPicPr>
                   </pic:nvPicPr>
                   <pic:blipFill>
-                    <a:blip r:embed="rId21" cstate="none"/>
+                    <a:blip r:embed="rId21"/>
                     <a:srcRect/>
                     <a:stretch>
                       <a:fillRect/>
@@ -4352,7 +4352,7 @@
           <wp:inline distT="0" distB="0" distL="0" distR="0">
             <wp:extent cx="3543300" cy="1571625"/>
             <wp:effectExtent t="0" r="0" b="0" l="0"/>
-            <wp:docPr id="1" name="table_3.2" descr="Table 3.2  Sexual-content complaints as % of each platform's complaints" title="Table 3.2  Sexual-content complaints as % of each platform's complaints"/>
+            <wp:docPr id="14" name="table_3.2" descr="Table 3.2  Sexual-content complaints as % of each platform's complaints" title="Table 3.2  Sexual-content complaints as % of each platform's complaints"/>
             <wp:cNvGraphicFramePr>
               <a:graphicFrameLocks xmlns:a="http://schemas.openxmlformats.org/drawingml/2006/main" noChangeAspect="1"/>
             </wp:cNvGraphicFramePr>
@@ -4360,13 +4360,13 @@
               <a:graphicData uri="http://schemas.openxmlformats.org/drawingml/2006/picture">
                 <pic:pic xmlns:pic="http://schemas.openxmlformats.org/drawingml/2006/picture">
                   <pic:nvPicPr>
-                    <pic:cNvPr id="0" name="" descr=""/>
+                    <pic:cNvPr id="14" name="Picture 14" descr=""/>
                     <pic:cNvPicPr>
                       <a:picLocks noChangeAspect="1" noChangeArrowheads="1"/>
                     </pic:cNvPicPr>
                   </pic:nvPicPr>
                   <pic:blipFill>
-                    <a:blip r:embed="rId22" cstate="none"/>
+                    <a:blip r:embed="rId22"/>
                     <a:srcRect/>
                     <a:stretch>
                       <a:fillRect/>
@@ -4445,7 +4445,7 @@
           <wp:inline distT="0" distB="0" distL="0" distR="0">
             <wp:extent cx="5734050" cy="1543050"/>
             <wp:effectExtent t="0" r="0" b="0" l="0"/>
-            <wp:docPr id="1" name="table_3.3" descr="Table 3.3  Growth per year, 2022–2024: main (share-adjusted) and secondary (raw)" title="Table 3.3  Growth per year, 2022–2024: main (share-adjusted) and secondary (raw)"/>
+            <wp:docPr id="15" name="table_3.3" descr="Table 3.3  Growth per year, 2022–2024: main (share-adjusted) and secondary (raw)" title="Table 3.3  Growth per year, 2022–2024: main (share-adjusted) and secondary (raw)"/>
             <wp:cNvGraphicFramePr>
               <a:graphicFrameLocks xmlns:a="http://schemas.openxmlformats.org/drawingml/2006/main" noChangeAspect="1"/>
             </wp:cNvGraphicFramePr>
@@ -4453,13 +4453,13 @@
               <a:graphicData uri="http://schemas.openxmlformats.org/drawingml/2006/picture">
                 <pic:pic xmlns:pic="http://schemas.openxmlformats.org/drawingml/2006/picture">
                   <pic:nvPicPr>
-                    <pic:cNvPr id="0" name="" descr=""/>
+                    <pic:cNvPr id="15" name="Picture 15" descr=""/>
                     <pic:cNvPicPr>
                       <a:picLocks noChangeAspect="1" noChangeArrowheads="1"/>
                     </pic:cNvPicPr>
                   </pic:nvPicPr>
                   <pic:blipFill>
-                    <a:blip r:embed="rId23" cstate="none"/>
+                    <a:blip r:embed="rId23"/>
                     <a:srcRect/>
                     <a:stretch>
                       <a:fillRect/>

</xml_diff>